<commit_message>
feat(pronto): les metadonnees d'une figure ou d'un tableau sont des paragraphes « SZH Cle Abb/Tab »
Fini le tableau enveloppe : les cles (Legende, Texte alternatif, Credit, Source) sont des
paragraphes d'un nouveau style clone de SZH Cle, borde a 1,5 pt en haut, a gauche et a
droite, places un ou deux paragraphes avant l'image ou le tableau (un vide tolere). Les deux
gabarits portent le style et les exemples ; le lecteur Pronto reconnait la nouvelle forme et
l'ancienne en repli, avec avertissement ; l'ecrivain du nettoyeur ecrit la nouvelle forme.
La table de correspondance comptait un bloc pour zero paragraphe : 540 entrees sur 706
etaient fausses sur le corpus, 0 desormais. Rendu des bordures prouve par le XML seul.

Co-Authored-By: Claude Fable 5.1 <noreply@anthropic.com>
</commit_message>
<xml_diff>
--- a/revue-template/Pronto - modele d'article.docx
+++ b/revue-template/Pronto - modele d'article.docx
@@ -956,9 +956,173 @@
         </w:rPr>
       </w:pPr>
     </w:p>
+    <w:p>
+      <w:pPr>
+        <w:pStyle w:val="SZHCleAbbTab"/>
+        <w:rPr>
+          <w:noProof/>
+          <w:lang w:val="fr-CH"/>
+        </w:rPr>
+      </w:pPr>
+      <w:r>
+        <w:rPr>
+          <w:noProof/>
+          <w:lang w:val="fr-CH"/>
+        </w:rPr>
+        <w:t xml:space="preserve">Légende : </w:t>
+      </w:r>
+    </w:p>
+    <w:p>
+      <w:pPr>
+        <w:pStyle w:val="SZHCleAbbTab"/>
+        <w:rPr>
+          <w:noProof/>
+          <w:lang w:val="fr-CH"/>
+        </w:rPr>
+      </w:pPr>
+      <w:r>
+        <w:rPr>
+          <w:noProof/>
+          <w:lang w:val="fr-CH"/>
+        </w:rPr>
+        <w:t xml:space="preserve">Texte alternatif : </w:t>
+      </w:r>
+    </w:p>
+    <w:p>
+      <w:pPr>
+        <w:pStyle w:val="SZHCleAbbTab"/>
+        <w:rPr>
+          <w:noProof/>
+          <w:lang w:val="fr-CH"/>
+        </w:rPr>
+      </w:pPr>
+      <w:r>
+        <w:rPr>
+          <w:noProof/>
+          <w:lang w:val="fr-CH"/>
+        </w:rPr>
+        <w:t xml:space="preserve">Crédit : </w:t>
+      </w:r>
+    </w:p>
+    <w:p>
+      <w:pPr>
+        <w:pStyle w:val="SZHCleAbbTab"/>
+        <w:rPr>
+          <w:noProof/>
+          <w:lang w:val="fr-CH"/>
+        </w:rPr>
+      </w:pPr>
+      <w:r>
+        <w:rPr>
+          <w:noProof/>
+          <w:lang w:val="fr-CH"/>
+        </w:rPr>
+        <w:t xml:space="preserve">Source : </w:t>
+      </w:r>
+    </w:p>
+    <w:p>
+      <w:pPr>
+        <w:pStyle w:val="SZHAide"/>
+        <w:rPr>
+          <w:b/>
+          <w:bCs/>
+          <w:noProof/>
+          <w:lang w:val="fr-CH"/>
+        </w:rPr>
+      </w:pPr>
+      <w:r>
+        <w:rPr>
+          <w:b/>
+          <w:bCs/>
+          <w:noProof/>
+          <w:lang w:val="fr-CH"/>
+        </w:rPr>
+        <w:t xml:space="preserve">{{IMAGE ICI}}</w:t>
+      </w:r>
+    </w:p>
+    <w:p>
+      <w:pPr>
+        <w:pStyle w:val="SZHAide"/>
+        <w:rPr>
+          <w:noProof/>
+          <w:lang w:val="fr-CH"/>
+        </w:rPr>
+      </w:pPr>
+      <w:r>
+        <w:rPr>
+          <w:noProof/>
+          <w:lang w:val="fr-CH"/>
+        </w:rPr>
+        <w:t xml:space="preserve">Copiez ces quatre paragraphes et l’image pour chaque nouvelle figure.</w:t>
+      </w:r>
+    </w:p>
+    <w:p>
+      <w:pPr>
+        <w:pStyle w:val="SZHCleAbbTab"/>
+        <w:rPr>
+          <w:noProof/>
+          <w:lang w:val="fr-CH"/>
+        </w:rPr>
+      </w:pPr>
+      <w:r>
+        <w:rPr>
+          <w:noProof/>
+          <w:lang w:val="fr-CH"/>
+        </w:rPr>
+        <w:t xml:space="preserve">Légende : </w:t>
+      </w:r>
+    </w:p>
+    <w:p>
+      <w:pPr>
+        <w:pStyle w:val="SZHCleAbbTab"/>
+        <w:rPr>
+          <w:noProof/>
+          <w:lang w:val="fr-CH"/>
+        </w:rPr>
+      </w:pPr>
+      <w:r>
+        <w:rPr>
+          <w:noProof/>
+          <w:lang w:val="fr-CH"/>
+        </w:rPr>
+        <w:t xml:space="preserve">Texte alternatif : </w:t>
+      </w:r>
+    </w:p>
+    <w:p>
+      <w:pPr>
+        <w:pStyle w:val="SZHCleAbbTab"/>
+        <w:rPr>
+          <w:noProof/>
+          <w:lang w:val="fr-CH"/>
+        </w:rPr>
+      </w:pPr>
+      <w:r>
+        <w:rPr>
+          <w:noProof/>
+          <w:lang w:val="fr-CH"/>
+        </w:rPr>
+        <w:t xml:space="preserve">Crédit : </w:t>
+      </w:r>
+    </w:p>
+    <w:p>
+      <w:pPr>
+        <w:pStyle w:val="SZHCleAbbTab"/>
+        <w:rPr>
+          <w:noProof/>
+          <w:lang w:val="fr-CH"/>
+        </w:rPr>
+      </w:pPr>
+      <w:r>
+        <w:rPr>
+          <w:noProof/>
+          <w:lang w:val="fr-CH"/>
+        </w:rPr>
+        <w:t xml:space="preserve">Source : </w:t>
+      </w:r>
+    </w:p>
     <w:tbl>
       <w:tblPr>
-        <w:tblW w:w="8220" w:type="dxa"/>
+        <w:tblW w:w="8000" w:type="dxa"/>
         <w:tblBorders>
           <w:top w:val="single" w:sz="4" w:space="0" w:color="BFBFBF"/>
           <w:left w:val="single" w:sz="4" w:space="0" w:color="BFBFBF"/>
@@ -967,150 +1131,86 @@
           <w:insideH w:val="single" w:sz="4" w:space="0" w:color="BFBFBF"/>
           <w:insideV w:val="single" w:sz="4" w:space="0" w:color="BFBFBF"/>
         </w:tblBorders>
-        <w:tblLayout w:type="fixed"/>
-        <w:tblCellMar>
-          <w:top w:w="57" w:type="dxa"/>
-          <w:left w:w="85" w:type="dxa"/>
-          <w:bottom w:w="57" w:type="dxa"/>
-          <w:right w:w="85" w:type="dxa"/>
-        </w:tblCellMar>
         <w:tblLook w:val="0000" w:firstRow="0" w:lastRow="0" w:firstColumn="0" w:lastColumn="0" w:noHBand="0" w:noVBand="0"/>
       </w:tblPr>
       <w:tblGrid>
-        <w:gridCol w:w="8220"/>
+        <w:gridCol w:w="4000"/>
+        <w:gridCol w:w="4000"/>
       </w:tblGrid>
       <w:tr>
         <w:tc>
           <w:tcPr>
-            <w:tcW w:w="8220" w:type="dxa"/>
+            <w:tcW w:w="4000" w:type="dxa"/>
           </w:tcPr>
           <w:p>
             <w:pPr>
-              <w:pStyle w:val="SZHCle"/>
-              <w:rPr>
-                <w:noProof/>
-                <w:lang w:val="fr-CH"/>
-              </w:rPr>
-            </w:pPr>
-            <w:r>
-              <w:rPr>
-                <w:noProof/>
-                <w:lang w:val="fr-CH"/>
-              </w:rPr>
-              <w:t xml:space="preserve">Légende : </w:t>
-            </w:r>
-          </w:p>
-          <w:p>
-            <w:pPr>
-              <w:pStyle w:val="SZHCle"/>
-              <w:rPr>
-                <w:noProof/>
-                <w:lang w:val="fr-CH"/>
-              </w:rPr>
-            </w:pPr>
-            <w:r>
-              <w:rPr>
-                <w:noProof/>
-                <w:lang w:val="fr-CH"/>
-              </w:rPr>
-              <w:t xml:space="preserve">Texte alternatif : </w:t>
-            </w:r>
-          </w:p>
-          <w:p>
-            <w:pPr>
-              <w:pStyle w:val="SZHCle"/>
-              <w:rPr>
-                <w:noProof/>
-                <w:lang w:val="fr-CH"/>
-              </w:rPr>
-            </w:pPr>
-            <w:r>
-              <w:rPr>
-                <w:noProof/>
-                <w:lang w:val="fr-CH"/>
-              </w:rPr>
-              <w:t xml:space="preserve">Crédit : </w:t>
-            </w:r>
-          </w:p>
-          <w:p>
-            <w:pPr>
-              <w:pStyle w:val="SZHCle"/>
-              <w:rPr>
-                <w:noProof/>
-                <w:lang w:val="fr-CH"/>
-              </w:rPr>
-            </w:pPr>
-            <w:r>
-              <w:rPr>
-                <w:noProof/>
-                <w:lang w:val="fr-CH"/>
-              </w:rPr>
-              <w:t xml:space="preserve">Source : </w:t>
-            </w:r>
-          </w:p>
-          <w:p>
-            <w:pPr>
-              <w:pStyle w:val="SZHAide"/>
-              <w:rPr>
-                <w:noProof/>
-                <w:lang w:val="fr-CH"/>
-              </w:rPr>
-            </w:pPr>
-            <w:r>
-              <w:rPr>
-                <w:noProof/>
-                <w:lang w:val="fr-CH"/>
-              </w:rPr>
-              <w:t xml:space="preserve">Copiez ce </w:t>
-            </w:r>
-            <w:r>
-              <w:rPr>
-                <w:noProof/>
-                <w:lang w:val="fr-CH"/>
-              </w:rPr>
-              <w:t>tableau</w:t>
-            </w:r>
-            <w:r>
-              <w:rPr>
-                <w:noProof/>
-                <w:lang w:val="fr-CH"/>
-              </w:rPr>
-              <w:t xml:space="preserve"> entier pour chaque nouvelle figure.</w:t>
+              <w:pStyle w:val="Corpsdetexte"/>
+            </w:pPr>
+            <w:r>
+              <w:t>Cellule 1</w:t>
+            </w:r>
+          </w:p>
+        </w:tc>
+        <w:tc>
+          <w:tcPr>
+            <w:tcW w:w="4000" w:type="dxa"/>
+          </w:tcPr>
+          <w:p>
+            <w:pPr>
+              <w:pStyle w:val="Corpsdetexte"/>
+            </w:pPr>
+            <w:r>
+              <w:t>Cellule 2</w:t>
             </w:r>
           </w:p>
         </w:tc>
       </w:tr>
       <w:tr>
-        <w:trPr>
-          <w:trHeight w:val="1701"/>
-        </w:trPr>
         <w:tc>
           <w:tcPr>
-            <w:tcW w:w="8220" w:type="dxa"/>
+            <w:tcW w:w="4000" w:type="dxa"/>
           </w:tcPr>
           <w:p>
             <w:pPr>
-              <w:pStyle w:val="SZHAide"/>
-              <w:rPr>
-                <w:b/>
-                <w:bCs/>
-                <w:noProof/>
-                <w:lang w:val="fr-CH"/>
-              </w:rPr>
-            </w:pPr>
-            <w:r>
-              <w:rPr>
-                <w:b/>
-                <w:bCs/>
-                <w:noProof/>
-                <w:lang w:val="fr-CH"/>
-              </w:rPr>
-              <w:t>{{IMAGE ICI}}</w:t>
+              <w:pStyle w:val="Corpsdetexte"/>
+            </w:pPr>
+            <w:r>
+              <w:t>Cellule 3</w:t>
+            </w:r>
+          </w:p>
+        </w:tc>
+        <w:tc>
+          <w:tcPr>
+            <w:tcW w:w="4000" w:type="dxa"/>
+          </w:tcPr>
+          <w:p>
+            <w:pPr>
+              <w:pStyle w:val="Corpsdetexte"/>
+            </w:pPr>
+            <w:r>
+              <w:t>Cellule 4</w:t>
             </w:r>
           </w:p>
         </w:tc>
       </w:tr>
     </w:tbl>
+    <w:p>
+      <w:pPr>
+        <w:pStyle w:val="SZHAide"/>
+        <w:rPr>
+          <w:noProof/>
+          <w:lang w:val="fr-CH"/>
+        </w:rPr>
+      </w:pPr>
+      <w:r>
+        <w:rPr>
+          <w:noProof/>
+          <w:lang w:val="fr-CH"/>
+        </w:rPr>
+        <w:t xml:space="preserve">Copiez ces quatre paragraphes et le tableau pour chaque nouveau tableau.</w:t>
+      </w:r>
+    </w:p>
+    <w:p/>
     <w:p>
       <w:pPr>
         <w:pStyle w:val="Citation"/>
@@ -2107,6 +2207,24 @@
       <w:sz w:val="20"/>
     </w:rPr>
   </w:style>
+  <w:style w:type="paragraph" w:customStyle="1" w:styleId="SZHCleAbbTab">
+    <w:name w:val="SZH Cle Abb/Tab"/>
+    <w:basedOn w:val="SZHCle"/>
+    <w:qFormat/>
+    <w:pPr>
+      <w:keepNext/>
+      <w:pBdr>
+        <w:top w:val="single" w:sz="12" w:space="4" w:color="auto"/>
+        <w:left w:val="single" w:sz="12" w:space="4" w:color="auto"/>
+        <w:right w:val="single" w:sz="12" w:space="4" w:color="auto"/>
+      </w:pBdr>
+    </w:pPr>
+    <w:rPr>
+      <w:b/>
+      <w:bCs/>
+      <w:sz w:val="20"/>
+    </w:rPr>
+  </w:style>
   <w:style w:type="paragraph" w:customStyle="1" w:styleId="SZHAide">
     <w:name w:val="SZH Aide"/>
     <w:basedOn w:val="Normal"/>

</xml_diff>